<commit_message>
docs: update the study report to the final human revision (methods-table citations repaired, repository link present)
</commit_message>
<xml_diff>
--- a/doc/study_report.docx
+++ b/doc/study_report.docx
@@ -403,6 +403,12 @@
           </w:tcPr>
           <w:p>
             <w:r>
+              <w:t>CQR score scaled by the spread of the ensemble</w:t>
+            </w:r>
+            <w:r>
+              <w:t xml:space="preserve"> </w:t>
+            </w:r>
+            <w:r>
               <w:t>[6]</w:t>
             </w:r>
           </w:p>
@@ -449,6 +455,12 @@
           </w:tcPr>
           <w:p>
             <w:r>
+              <w:t>Density level-set score</w:t>
+            </w:r>
+            <w:r>
+              <w:t xml:space="preserve"> </w:t>
+            </w:r>
+            <w:r>
               <w:t>[7]</w:t>
             </w:r>
           </w:p>
@@ -495,6 +507,12 @@
           </w:tcPr>
           <w:p>
             <w:r>
+              <w:t>CQR score with likelihood-ratio weighted quantile</w:t>
+            </w:r>
+            <w:r>
+              <w:t xml:space="preserve"> </w:t>
+            </w:r>
+            <w:r>
               <w:t>[8]</w:t>
             </w:r>
           </w:p>
@@ -540,6 +558,12 @@
             <w:shd w:val="clear" w:color="auto" w:fill="FAF6F5"/>
           </w:tcPr>
           <w:p>
+            <w:r>
+              <w:t>Loss-scaled score with weighted quantile</w:t>
+            </w:r>
+            <w:r>
+              <w:t xml:space="preserve"> </w:t>
+            </w:r>
             <w:r>
               <w:t>[9]</w:t>
             </w:r>
@@ -2496,7 +2520,18 @@
     </w:p>
     <w:p>
       <w:r>
-        <w:t>The experiment code and the verified result records are available at https://github.com/mqignacio/rul-uq-benchmark.</w:t>
+        <w:t xml:space="preserve">The experiment code and the verified result records are available at </w:t>
+      </w:r>
+      <w:hyperlink r:id="rId9" w:history="1">
+        <w:r>
+          <w:rPr>
+            <w:rStyle w:val="Hyperlink"/>
+          </w:rPr>
+          <w:t>https://github.com/mqignacio/rul-uq-benchmark</w:t>
+        </w:r>
+      </w:hyperlink>
+      <w:r>
+        <w:t>.</w:t>
       </w:r>
     </w:p>
     <w:p>
@@ -3274,6 +3309,7 @@
           </w:tcPr>
           <w:p>
             <w:r>
+              <w:lastRenderedPageBreak/>
               <w:t>Raw QRNN</w:t>
             </w:r>
           </w:p>
@@ -3360,7 +3396,6 @@
         <w:pStyle w:val="Heading2"/>
       </w:pPr>
       <w:r>
-        <w:lastRenderedPageBreak/>
         <w:t>12.2 N-CMAPSS (shifted): point accuracy and efficiency</w:t>
       </w:r>
     </w:p>
@@ -5087,6 +5122,7 @@
           </w:tcPr>
           <w:p>
             <w:r>
+              <w:lastRenderedPageBreak/>
               <w:t>EDL</w:t>
             </w:r>
           </w:p>
@@ -5166,11 +5202,7 @@
           </w:tcPr>
           <w:p>
             <w:r>
-              <w:t xml:space="preserve">0.8137 ± </w:t>
-            </w:r>
-            <w:r>
-              <w:lastRenderedPageBreak/>
-              <w:t>0.0352</w:t>
+              <w:t>0.8137 ± 0.0352</w:t>
             </w:r>
           </w:p>
         </w:tc>
@@ -5181,12 +5213,7 @@
           </w:tcPr>
           <w:p>
             <w:r>
-              <w:lastRenderedPageBreak/>
-              <w:t xml:space="preserve">0.0863 ± </w:t>
-            </w:r>
-            <w:r>
-              <w:lastRenderedPageBreak/>
-              <w:t>0.0352</w:t>
+              <w:t>0.0863 ± 0.0352</w:t>
             </w:r>
           </w:p>
         </w:tc>
@@ -5197,12 +5224,7 @@
           </w:tcPr>
           <w:p>
             <w:r>
-              <w:lastRenderedPageBreak/>
-              <w:t xml:space="preserve">0.6483 ± </w:t>
-            </w:r>
-            <w:r>
-              <w:lastRenderedPageBreak/>
-              <w:t>0.0719</w:t>
+              <w:t>0.6483 ± 0.0719</w:t>
             </w:r>
           </w:p>
         </w:tc>
@@ -5213,12 +5235,7 @@
           </w:tcPr>
           <w:p>
             <w:r>
-              <w:lastRenderedPageBreak/>
-              <w:t xml:space="preserve">3.3715 ± </w:t>
-            </w:r>
-            <w:r>
-              <w:lastRenderedPageBreak/>
-              <w:t>0.8044</w:t>
+              <w:t>3.3715 ± 0.8044</w:t>
             </w:r>
           </w:p>
         </w:tc>
@@ -5229,12 +5246,7 @@
           </w:tcPr>
           <w:p>
             <w:r>
-              <w:lastRenderedPageBreak/>
-              <w:t xml:space="preserve">63.3813 ± </w:t>
-            </w:r>
-            <w:r>
-              <w:lastRenderedPageBreak/>
-              <w:t>5.4415</w:t>
+              <w:t>63.3813 ± 5.4415</w:t>
             </w:r>
           </w:p>
         </w:tc>
@@ -5247,7 +5259,6 @@
           </w:tcPr>
           <w:p>
             <w:r>
-              <w:lastRenderedPageBreak/>
               <w:t>C-XGBQ</w:t>
             </w:r>
           </w:p>
@@ -6757,6 +6768,7 @@
           </w:tcPr>
           <w:p>
             <w:r>
+              <w:lastRenderedPageBreak/>
               <w:t>UACQR-S-style</w:t>
             </w:r>
           </w:p>
@@ -6814,7 +6826,6 @@
           </w:tcPr>
           <w:p>
             <w:r>
-              <w:lastRenderedPageBreak/>
               <w:t>Weighted-CP CQR</w:t>
             </w:r>
           </w:p>
@@ -7665,6 +7676,7 @@
         <w:t>The sample-weighted pooled coverage on the shifted population. The 90% nominal is the reference.</w:t>
       </w:r>
     </w:p>
+    <w:p/>
     <w:tbl>
       <w:tblPr>
         <w:tblStyle w:val="TableGrid"/>
@@ -7690,6 +7702,7 @@
               <w:rPr>
                 <w:b/>
               </w:rPr>
+              <w:lastRenderedPageBreak/>
               <w:t>Method</w:t>
             </w:r>
           </w:p>
@@ -7765,7 +7778,6 @@
           </w:tcPr>
           <w:p>
             <w:r>
-              <w:lastRenderedPageBreak/>
               <w:t>DistCP/HPD-split</w:t>
             </w:r>
           </w:p>
@@ -7989,8 +8001,6 @@
         </w:numPr>
         <w:ind w:left="360" w:hanging="360"/>
       </w:pPr>
-      <w:proofErr w:type="spellStart"/>
-      <w:proofErr w:type="spellEnd"/>
       <w:r>
         <w:t>[9] S. Alijani and H. Najjaran, "WQLCP: Weighted Adaptive Conformal Prediction for Robust Uncertainty Quantification Under Distribution Shifts," arXiv:2505.19587, 2025.</w:t>
       </w:r>
@@ -8005,7 +8015,7 @@
       </w:pPr>
     </w:p>
     <w:sectPr>
-      <w:footerReference w:type="default" r:id="rId9"/>
+      <w:footerReference w:type="default" r:id="rId10"/>
       <w:pgSz w:w="12240" w:h="15840"/>
       <w:pgMar w:top="1440" w:right="1800" w:bottom="1440" w:left="1800" w:header="720" w:footer="720" w:gutter="0"/>
       <w:cols w:space="720"/>
@@ -19700,12 +19710,23 @@
     <w:name w:val="Hyperlink"/>
     <w:basedOn w:val="DefaultParagraphFont"/>
     <w:uiPriority w:val="99"/>
-    <w:semiHidden/>
     <w:unhideWhenUsed/>
     <w:rsid w:val="00AA6637"/>
     <w:rPr>
       <w:color w:val="0000FF"/>
       <w:u w:val="single"/>
+    </w:rPr>
+  </w:style>
+  <w:style w:type="character" w:styleId="UnresolvedMention">
+    <w:name w:val="Unresolved Mention"/>
+    <w:basedOn w:val="DefaultParagraphFont"/>
+    <w:uiPriority w:val="99"/>
+    <w:semiHidden/>
+    <w:unhideWhenUsed/>
+    <w:rsid w:val="00D71D4D"/>
+    <w:rPr>
+      <w:color w:val="605E5C"/>
+      <w:shd w:val="clear" w:color="auto" w:fill="E1DFDD"/>
     </w:rPr>
   </w:style>
 </w:styles>

</xml_diff>